<commit_message>
Update documentation with data validation checks
- Revised the "data.docx" file to enhance clarity and structure.
- Added sections for data validation checks, including checks for pathways, stop_times, and trips.
- Included specific conditions and examples for data integrity, such as the relationship between entries and platforms.
</commit_message>
<xml_diff>
--- a/documentation/data.docx
+++ b/documentation/data.docx
@@ -6,6 +6,40 @@
       <w:pPr>
         <w:rPr>
           <w:rFonts w:ascii="Arial" w:hAnsi="Arial" w:cs="Arial"/>
+          <w:b/>
+          <w:bCs/>
+          <w:sz w:val="28"/>
+          <w:szCs w:val="28"/>
+          <w:u w:val="single"/>
+        </w:rPr>
+      </w:pPr>
+      <w:r>
+        <w:rPr>
+          <w:rFonts w:ascii="Arial" w:hAnsi="Arial" w:cs="Arial"/>
+          <w:b/>
+          <w:bCs/>
+          <w:sz w:val="28"/>
+          <w:szCs w:val="28"/>
+          <w:u w:val="single"/>
+        </w:rPr>
+        <w:t>D</w:t>
+      </w:r>
+      <w:r>
+        <w:rPr>
+          <w:rFonts w:ascii="Arial" w:hAnsi="Arial" w:cs="Arial"/>
+          <w:b/>
+          <w:bCs/>
+          <w:sz w:val="28"/>
+          <w:szCs w:val="28"/>
+          <w:u w:val="single"/>
+        </w:rPr>
+        <w:t>ata</w:t>
+      </w:r>
+    </w:p>
+    <w:p>
+      <w:pPr>
+        <w:rPr>
+          <w:rFonts w:ascii="Arial" w:hAnsi="Arial" w:cs="Arial"/>
           <w:sz w:val="24"/>
           <w:szCs w:val="24"/>
         </w:rPr>
@@ -16,40 +50,751 @@
           <w:sz w:val="24"/>
           <w:szCs w:val="24"/>
         </w:rPr>
-        <w:t>DATA</w:t>
-      </w:r>
-    </w:p>
-    <w:p>
-      <w:pPr>
+        <w:t>La columna de “</w:t>
+      </w:r>
+      <w:proofErr w:type="spellStart"/>
+      <w:r>
         <w:rPr>
           <w:rFonts w:ascii="Arial" w:hAnsi="Arial" w:cs="Arial"/>
           <w:sz w:val="24"/>
           <w:szCs w:val="24"/>
         </w:rPr>
-      </w:pPr>
+        <w:t>signposted_as</w:t>
+      </w:r>
+      <w:proofErr w:type="spellEnd"/>
       <w:r>
         <w:rPr>
           <w:rFonts w:ascii="Arial" w:hAnsi="Arial" w:cs="Arial"/>
           <w:sz w:val="24"/>
           <w:szCs w:val="24"/>
         </w:rPr>
-        <w:t>La columna de “signposted_as” de “pathways” es podria utilitzar per donar indicacions del trajecte (pels transbords i les sortides). COMPTE: aquests comentaris estan en català i no els traduiré pel repositori (</w:t>
-      </w:r>
+        <w:t>” de “</w:t>
+      </w:r>
+      <w:proofErr w:type="spellStart"/>
       <w:r>
         <w:rPr>
           <w:rFonts w:ascii="Arial" w:hAnsi="Arial" w:cs="Arial"/>
           <w:sz w:val="24"/>
           <w:szCs w:val="24"/>
         </w:rPr>
-        <w:sym w:font="Wingdings" w:char="F0DF"/>
-      </w:r>
+        <w:t>pathways</w:t>
+      </w:r>
+      <w:proofErr w:type="spellEnd"/>
       <w:r>
         <w:rPr>
           <w:rFonts w:ascii="Arial" w:hAnsi="Arial" w:cs="Arial"/>
           <w:sz w:val="24"/>
           <w:szCs w:val="24"/>
         </w:rPr>
+        <w:t xml:space="preserve">” es podria utilitzar per donar indicacions del trajecte (pels transbords i les sortides). COMPTE: aquests comentaris estan en català i no els traduiré pel </w:t>
+      </w:r>
+      <w:proofErr w:type="spellStart"/>
+      <w:r>
+        <w:rPr>
+          <w:rFonts w:ascii="Arial" w:hAnsi="Arial" w:cs="Arial"/>
+          <w:sz w:val="24"/>
+          <w:szCs w:val="24"/>
+        </w:rPr>
+        <w:t>repositori</w:t>
+      </w:r>
+      <w:proofErr w:type="spellEnd"/>
+      <w:r>
+        <w:rPr>
+          <w:rFonts w:ascii="Arial" w:hAnsi="Arial" w:cs="Arial"/>
+          <w:sz w:val="24"/>
+          <w:szCs w:val="24"/>
+        </w:rPr>
+        <w:t xml:space="preserve"> (</w:t>
+      </w:r>
+      <w:r>
+        <w:rPr>
+          <w:rFonts w:ascii="Arial" w:hAnsi="Arial" w:cs="Arial"/>
+          <w:sz w:val="24"/>
+          <w:szCs w:val="24"/>
+        </w:rPr>
+        <w:sym w:font="Wingdings" w:char="F0DF"/>
+      </w:r>
+      <w:r>
+        <w:rPr>
+          <w:rFonts w:ascii="Arial" w:hAnsi="Arial" w:cs="Arial"/>
+          <w:sz w:val="24"/>
+          <w:szCs w:val="24"/>
+        </w:rPr>
         <w:t xml:space="preserve"> es podria fer perquè realment hi ha un nombre finit de paraules que no són noms propis com accés, correspondència, sortida per, etc.).</w:t>
+      </w:r>
+    </w:p>
+    <w:p>
+      <w:pPr>
+        <w:rPr>
+          <w:rFonts w:ascii="Arial" w:hAnsi="Arial" w:cs="Arial"/>
+          <w:sz w:val="24"/>
+          <w:szCs w:val="24"/>
+        </w:rPr>
+      </w:pPr>
+    </w:p>
+    <w:p>
+      <w:pPr>
+        <w:rPr>
+          <w:rFonts w:ascii="Arial" w:hAnsi="Arial" w:cs="Arial"/>
+          <w:sz w:val="24"/>
+          <w:szCs w:val="24"/>
+        </w:rPr>
+      </w:pPr>
+    </w:p>
+    <w:p>
+      <w:pPr>
+        <w:rPr>
+          <w:rFonts w:ascii="Arial" w:hAnsi="Arial" w:cs="Arial"/>
+          <w:b/>
+          <w:bCs/>
+          <w:sz w:val="28"/>
+          <w:szCs w:val="28"/>
+          <w:u w:val="single"/>
+        </w:rPr>
+      </w:pPr>
+      <w:r>
+        <w:rPr>
+          <w:rFonts w:ascii="Arial" w:hAnsi="Arial" w:cs="Arial"/>
+          <w:b/>
+          <w:bCs/>
+          <w:sz w:val="28"/>
+          <w:szCs w:val="28"/>
+          <w:u w:val="single"/>
+        </w:rPr>
+        <w:t>Comprovacions de les dades</w:t>
+      </w:r>
+    </w:p>
+    <w:p>
+      <w:pPr>
+        <w:rPr>
+          <w:rFonts w:ascii="Arial" w:hAnsi="Arial" w:cs="Arial"/>
+        </w:rPr>
+      </w:pPr>
+      <w:r>
+        <w:rPr>
+          <w:rFonts w:ascii="Arial" w:hAnsi="Arial" w:cs="Arial"/>
+        </w:rPr>
+        <w:t>Comprovacions</w:t>
+      </w:r>
+    </w:p>
+    <w:p>
+      <w:pPr>
+        <w:numPr>
+          <w:ilvl w:val="0"/>
+          <w:numId w:val="1"/>
+        </w:numPr>
+        <w:spacing w:line="278" w:lineRule="auto"/>
+        <w:rPr>
+          <w:rFonts w:ascii="Arial" w:hAnsi="Arial" w:cs="Arial"/>
+        </w:rPr>
+      </w:pPr>
+      <w:r>
+        <w:rPr>
+          <w:rFonts w:ascii="Arial" w:hAnsi="Arial" w:cs="Arial"/>
+        </w:rPr>
+        <w:t>Comprovacions connexions entre fitxers</w:t>
+      </w:r>
+    </w:p>
+    <w:p>
+      <w:pPr>
+        <w:numPr>
+          <w:ilvl w:val="1"/>
+          <w:numId w:val="1"/>
+        </w:numPr>
+        <w:spacing w:line="278" w:lineRule="auto"/>
+        <w:rPr>
+          <w:rFonts w:ascii="Arial" w:hAnsi="Arial" w:cs="Arial"/>
+        </w:rPr>
+      </w:pPr>
+      <w:r>
+        <w:rPr>
+          <w:rFonts w:ascii="Arial" w:hAnsi="Arial" w:cs="Arial"/>
+        </w:rPr>
+        <w:t xml:space="preserve">Totes les </w:t>
+      </w:r>
+      <w:proofErr w:type="spellStart"/>
+      <w:r>
+        <w:rPr>
+          <w:rFonts w:ascii="Arial" w:hAnsi="Arial" w:cs="Arial"/>
+        </w:rPr>
+        <w:t>stop_id</w:t>
+      </w:r>
+      <w:proofErr w:type="spellEnd"/>
+      <w:r>
+        <w:rPr>
+          <w:rFonts w:ascii="Arial" w:hAnsi="Arial" w:cs="Arial"/>
+        </w:rPr>
+        <w:t xml:space="preserve"> de </w:t>
+      </w:r>
+      <w:proofErr w:type="spellStart"/>
+      <w:r>
+        <w:rPr>
+          <w:rFonts w:ascii="Arial" w:hAnsi="Arial" w:cs="Arial"/>
+        </w:rPr>
+        <w:t>pathways</w:t>
+      </w:r>
+      <w:proofErr w:type="spellEnd"/>
+      <w:r>
+        <w:rPr>
+          <w:rFonts w:ascii="Arial" w:hAnsi="Arial" w:cs="Arial"/>
+        </w:rPr>
+        <w:t xml:space="preserve"> i </w:t>
+      </w:r>
+      <w:proofErr w:type="spellStart"/>
+      <w:r>
+        <w:rPr>
+          <w:rFonts w:ascii="Arial" w:hAnsi="Arial" w:cs="Arial"/>
+        </w:rPr>
+        <w:t>stop_times</w:t>
+      </w:r>
+      <w:proofErr w:type="spellEnd"/>
+      <w:r>
+        <w:rPr>
+          <w:rFonts w:ascii="Arial" w:hAnsi="Arial" w:cs="Arial"/>
+        </w:rPr>
+        <w:t xml:space="preserve"> estan a stops</w:t>
+      </w:r>
+    </w:p>
+    <w:p>
+      <w:pPr>
+        <w:numPr>
+          <w:ilvl w:val="1"/>
+          <w:numId w:val="1"/>
+        </w:numPr>
+        <w:spacing w:line="278" w:lineRule="auto"/>
+        <w:rPr>
+          <w:rFonts w:ascii="Arial" w:hAnsi="Arial" w:cs="Arial"/>
+        </w:rPr>
+      </w:pPr>
+      <w:r>
+        <w:rPr>
+          <w:rFonts w:ascii="Arial" w:hAnsi="Arial" w:cs="Arial"/>
+        </w:rPr>
+        <w:t xml:space="preserve">Tot </w:t>
+      </w:r>
+      <w:proofErr w:type="spellStart"/>
+      <w:r>
+        <w:rPr>
+          <w:rFonts w:ascii="Arial" w:hAnsi="Arial" w:cs="Arial"/>
+        </w:rPr>
+        <w:t>route_id</w:t>
+      </w:r>
+      <w:proofErr w:type="spellEnd"/>
+      <w:r>
+        <w:rPr>
+          <w:rFonts w:ascii="Arial" w:hAnsi="Arial" w:cs="Arial"/>
+        </w:rPr>
+        <w:t xml:space="preserve"> de trips està a </w:t>
+      </w:r>
+      <w:proofErr w:type="spellStart"/>
+      <w:r>
+        <w:rPr>
+          <w:rFonts w:ascii="Arial" w:hAnsi="Arial" w:cs="Arial"/>
+        </w:rPr>
+        <w:t>routes</w:t>
+      </w:r>
+      <w:proofErr w:type="spellEnd"/>
+    </w:p>
+    <w:p>
+      <w:pPr>
+        <w:numPr>
+          <w:ilvl w:val="1"/>
+          <w:numId w:val="1"/>
+        </w:numPr>
+        <w:spacing w:line="278" w:lineRule="auto"/>
+        <w:rPr>
+          <w:rFonts w:ascii="Arial" w:hAnsi="Arial" w:cs="Arial"/>
+        </w:rPr>
+      </w:pPr>
+      <w:r>
+        <w:rPr>
+          <w:rFonts w:ascii="Arial" w:hAnsi="Arial" w:cs="Arial"/>
+        </w:rPr>
+        <w:t xml:space="preserve">Tot </w:t>
+      </w:r>
+      <w:proofErr w:type="spellStart"/>
+      <w:r>
+        <w:rPr>
+          <w:rFonts w:ascii="Arial" w:hAnsi="Arial" w:cs="Arial"/>
+        </w:rPr>
+        <w:t>trip_id</w:t>
+      </w:r>
+      <w:proofErr w:type="spellEnd"/>
+      <w:r>
+        <w:rPr>
+          <w:rFonts w:ascii="Arial" w:hAnsi="Arial" w:cs="Arial"/>
+        </w:rPr>
+        <w:t xml:space="preserve"> de </w:t>
+      </w:r>
+      <w:proofErr w:type="spellStart"/>
+      <w:r>
+        <w:rPr>
+          <w:rFonts w:ascii="Arial" w:hAnsi="Arial" w:cs="Arial"/>
+        </w:rPr>
+        <w:t>stops_times</w:t>
+      </w:r>
+      <w:proofErr w:type="spellEnd"/>
+      <w:r>
+        <w:rPr>
+          <w:rFonts w:ascii="Arial" w:hAnsi="Arial" w:cs="Arial"/>
+        </w:rPr>
+        <w:t xml:space="preserve"> està a trips</w:t>
+      </w:r>
+    </w:p>
+    <w:p>
+      <w:pPr>
+        <w:numPr>
+          <w:ilvl w:val="0"/>
+          <w:numId w:val="1"/>
+        </w:numPr>
+        <w:spacing w:line="278" w:lineRule="auto"/>
+        <w:rPr>
+          <w:rFonts w:ascii="Arial" w:hAnsi="Arial" w:cs="Arial"/>
+        </w:rPr>
+      </w:pPr>
+      <w:r>
+        <w:rPr>
+          <w:rFonts w:ascii="Arial" w:hAnsi="Arial" w:cs="Arial"/>
+        </w:rPr>
+        <w:t xml:space="preserve">Comprovacions de </w:t>
+      </w:r>
+      <w:proofErr w:type="spellStart"/>
+      <w:r>
+        <w:rPr>
+          <w:rFonts w:ascii="Arial" w:hAnsi="Arial" w:cs="Arial"/>
+        </w:rPr>
+        <w:t>pathways</w:t>
+      </w:r>
+      <w:proofErr w:type="spellEnd"/>
+    </w:p>
+    <w:p>
+      <w:pPr>
+        <w:numPr>
+          <w:ilvl w:val="1"/>
+          <w:numId w:val="1"/>
+        </w:numPr>
+        <w:spacing w:line="278" w:lineRule="auto"/>
+        <w:rPr>
+          <w:rFonts w:ascii="Arial" w:hAnsi="Arial" w:cs="Arial"/>
+        </w:rPr>
+      </w:pPr>
+      <w:proofErr w:type="spellStart"/>
+      <w:r>
+        <w:rPr>
+          <w:rFonts w:ascii="Arial" w:hAnsi="Arial" w:cs="Arial"/>
+        </w:rPr>
+        <w:t>Transfers</w:t>
+      </w:r>
+      <w:proofErr w:type="spellEnd"/>
+      <w:r>
+        <w:rPr>
+          <w:rFonts w:ascii="Arial" w:hAnsi="Arial" w:cs="Arial"/>
+        </w:rPr>
+        <w:t xml:space="preserve"> inclòs a </w:t>
+      </w:r>
+      <w:proofErr w:type="spellStart"/>
+      <w:r>
+        <w:rPr>
+          <w:rFonts w:ascii="Arial" w:hAnsi="Arial" w:cs="Arial"/>
+        </w:rPr>
+        <w:t>pathways</w:t>
+      </w:r>
+      <w:proofErr w:type="spellEnd"/>
+      <w:r>
+        <w:rPr>
+          <w:rFonts w:ascii="Arial" w:hAnsi="Arial" w:cs="Arial"/>
+        </w:rPr>
+        <w:t xml:space="preserve"> </w:t>
+      </w:r>
+    </w:p>
+    <w:p>
+      <w:pPr>
+        <w:numPr>
+          <w:ilvl w:val="1"/>
+          <w:numId w:val="1"/>
+        </w:numPr>
+        <w:spacing w:line="278" w:lineRule="auto"/>
+        <w:rPr>
+          <w:rFonts w:ascii="Arial" w:hAnsi="Arial" w:cs="Arial"/>
+        </w:rPr>
+      </w:pPr>
+      <w:r>
+        <w:rPr>
+          <w:rFonts w:ascii="Arial" w:hAnsi="Arial" w:cs="Arial"/>
+        </w:rPr>
+        <w:t xml:space="preserve">A </w:t>
+      </w:r>
+      <w:proofErr w:type="spellStart"/>
+      <w:r>
+        <w:rPr>
+          <w:rFonts w:ascii="Arial" w:hAnsi="Arial" w:cs="Arial"/>
+        </w:rPr>
+        <w:t>pathways</w:t>
+      </w:r>
+      <w:proofErr w:type="spellEnd"/>
+      <w:r>
+        <w:rPr>
+          <w:rFonts w:ascii="Arial" w:hAnsi="Arial" w:cs="Arial"/>
+        </w:rPr>
+        <w:t xml:space="preserve"> existeixen sempre les combinacions dels dos sentits</w:t>
+      </w:r>
+      <w:r>
+        <w:rPr>
+          <w:rFonts w:ascii="Arial" w:hAnsi="Arial" w:cs="Arial"/>
+        </w:rPr>
+        <w:t xml:space="preserve">? NO </w:t>
+      </w:r>
+      <w:r>
+        <w:rPr>
+          <w:rFonts w:ascii="Arial" w:hAnsi="Arial" w:cs="Arial"/>
+        </w:rPr>
+        <w:sym w:font="Wingdings" w:char="F0E0"/>
+      </w:r>
+      <w:r>
+        <w:rPr>
+          <w:rFonts w:ascii="Arial" w:hAnsi="Arial" w:cs="Arial"/>
+        </w:rPr>
+        <w:t xml:space="preserve"> donar cas concret </w:t>
+      </w:r>
+    </w:p>
+    <w:p>
+      <w:pPr>
+        <w:numPr>
+          <w:ilvl w:val="1"/>
+          <w:numId w:val="1"/>
+        </w:numPr>
+        <w:spacing w:line="278" w:lineRule="auto"/>
+        <w:rPr>
+          <w:rFonts w:ascii="Arial" w:hAnsi="Arial" w:cs="Arial"/>
+        </w:rPr>
+      </w:pPr>
+      <w:proofErr w:type="spellStart"/>
+      <w:r>
+        <w:rPr>
+          <w:rFonts w:ascii="Arial" w:hAnsi="Arial" w:cs="Arial"/>
+        </w:rPr>
+        <w:t>Traversal_time</w:t>
+      </w:r>
+      <w:proofErr w:type="spellEnd"/>
+      <w:r>
+        <w:rPr>
+          <w:rFonts w:ascii="Arial" w:hAnsi="Arial" w:cs="Arial"/>
+        </w:rPr>
+        <w:t xml:space="preserve"> igual pels dos sentits (excepte quan no hi ha un sentit </w:t>
+      </w:r>
+      <w:r>
+        <w:rPr>
+          <w:rFonts w:ascii="Arial" w:hAnsi="Arial" w:cs="Arial"/>
+        </w:rPr>
+        <w:sym w:font="Wingdings" w:char="F0E0"/>
+      </w:r>
+      <w:r>
+        <w:rPr>
+          <w:rFonts w:ascii="Arial" w:hAnsi="Arial" w:cs="Arial"/>
+        </w:rPr>
+        <w:t xml:space="preserve"> cas concret)</w:t>
+      </w:r>
+    </w:p>
+    <w:p>
+      <w:pPr>
+        <w:numPr>
+          <w:ilvl w:val="1"/>
+          <w:numId w:val="1"/>
+        </w:numPr>
+        <w:spacing w:line="278" w:lineRule="auto"/>
+        <w:rPr>
+          <w:rFonts w:ascii="Arial" w:hAnsi="Arial" w:cs="Arial"/>
+        </w:rPr>
+      </w:pPr>
+      <w:proofErr w:type="spellStart"/>
+      <w:r>
+        <w:rPr>
+          <w:rFonts w:ascii="Arial" w:hAnsi="Arial" w:cs="Arial"/>
+        </w:rPr>
+        <w:t>Traversal_time</w:t>
+      </w:r>
+      <w:proofErr w:type="spellEnd"/>
+      <w:r>
+        <w:rPr>
+          <w:rFonts w:ascii="Arial" w:hAnsi="Arial" w:cs="Arial"/>
+        </w:rPr>
+        <w:t xml:space="preserve"> múltiple de 15 (només curiositat) </w:t>
+      </w:r>
+    </w:p>
+    <w:p>
+      <w:pPr>
+        <w:numPr>
+          <w:ilvl w:val="1"/>
+          <w:numId w:val="1"/>
+        </w:numPr>
+        <w:spacing w:line="278" w:lineRule="auto"/>
+        <w:rPr>
+          <w:rFonts w:ascii="Arial" w:hAnsi="Arial" w:cs="Arial"/>
+        </w:rPr>
+      </w:pPr>
+      <w:r>
+        <w:rPr>
+          <w:rFonts w:ascii="Arial" w:hAnsi="Arial" w:cs="Arial"/>
+        </w:rPr>
+        <w:t xml:space="preserve">Cada entrada té una andana </w:t>
+      </w:r>
+    </w:p>
+    <w:p>
+      <w:pPr>
+        <w:numPr>
+          <w:ilvl w:val="1"/>
+          <w:numId w:val="1"/>
+        </w:numPr>
+        <w:spacing w:line="278" w:lineRule="auto"/>
+        <w:rPr>
+          <w:rFonts w:ascii="Arial" w:hAnsi="Arial" w:cs="Arial"/>
+        </w:rPr>
+      </w:pPr>
+      <w:r>
+        <w:rPr>
+          <w:rFonts w:ascii="Arial" w:hAnsi="Arial" w:cs="Arial"/>
+        </w:rPr>
+        <w:t xml:space="preserve">NO cada andana té una entrada però sí que aquestes estan relacionades amb una altra andana que sí que té entrada (no hi ha cap andana incomunicada) </w:t>
+      </w:r>
+      <w:r>
+        <w:rPr>
+          <w:rFonts w:ascii="Arial" w:hAnsi="Arial" w:cs="Arial"/>
+        </w:rPr>
+        <w:sym w:font="Wingdings" w:char="F0E0"/>
+      </w:r>
+      <w:r>
+        <w:rPr>
+          <w:rFonts w:ascii="Arial" w:hAnsi="Arial" w:cs="Arial"/>
+        </w:rPr>
+        <w:t xml:space="preserve"> donar exemples </w:t>
+      </w:r>
+    </w:p>
+    <w:p>
+      <w:pPr>
+        <w:numPr>
+          <w:ilvl w:val="1"/>
+          <w:numId w:val="1"/>
+        </w:numPr>
+        <w:spacing w:line="278" w:lineRule="auto"/>
+        <w:rPr>
+          <w:rFonts w:ascii="Arial" w:hAnsi="Arial" w:cs="Arial"/>
+        </w:rPr>
+      </w:pPr>
+      <w:r>
+        <w:rPr>
+          <w:rFonts w:ascii="Arial" w:hAnsi="Arial" w:cs="Arial"/>
+        </w:rPr>
+        <w:t xml:space="preserve">Totes les andanes de diferents línies d’una mateixa parada estan connectades dos a dos entre elles. </w:t>
+      </w:r>
+    </w:p>
+    <w:p>
+      <w:pPr>
+        <w:numPr>
+          <w:ilvl w:val="0"/>
+          <w:numId w:val="1"/>
+        </w:numPr>
+        <w:spacing w:line="278" w:lineRule="auto"/>
+        <w:rPr>
+          <w:rFonts w:ascii="Arial" w:hAnsi="Arial" w:cs="Arial"/>
+        </w:rPr>
+      </w:pPr>
+      <w:r>
+        <w:rPr>
+          <w:rFonts w:ascii="Arial" w:hAnsi="Arial" w:cs="Arial"/>
+        </w:rPr>
+        <w:t xml:space="preserve">Comprovacions de </w:t>
+      </w:r>
+      <w:proofErr w:type="spellStart"/>
+      <w:r>
+        <w:rPr>
+          <w:rFonts w:ascii="Arial" w:hAnsi="Arial" w:cs="Arial"/>
+        </w:rPr>
+        <w:t>stop_times</w:t>
+      </w:r>
+      <w:proofErr w:type="spellEnd"/>
+    </w:p>
+    <w:p>
+      <w:pPr>
+        <w:numPr>
+          <w:ilvl w:val="1"/>
+          <w:numId w:val="1"/>
+        </w:numPr>
+        <w:spacing w:line="278" w:lineRule="auto"/>
+        <w:rPr>
+          <w:rFonts w:ascii="Arial" w:hAnsi="Arial" w:cs="Arial"/>
+        </w:rPr>
+      </w:pPr>
+      <w:r>
+        <w:rPr>
+          <w:rFonts w:ascii="Arial" w:hAnsi="Arial" w:cs="Arial"/>
+        </w:rPr>
+        <w:t xml:space="preserve">Repeticions de blocs de </w:t>
+      </w:r>
+      <w:proofErr w:type="spellStart"/>
+      <w:r>
+        <w:rPr>
+          <w:rFonts w:ascii="Arial" w:hAnsi="Arial" w:cs="Arial"/>
+        </w:rPr>
+        <w:t>trip_id</w:t>
+      </w:r>
+      <w:proofErr w:type="spellEnd"/>
+      <w:r>
+        <w:rPr>
+          <w:rFonts w:ascii="Arial" w:hAnsi="Arial" w:cs="Arial"/>
+        </w:rPr>
+        <w:t xml:space="preserve"> sencers a </w:t>
+      </w:r>
+      <w:proofErr w:type="spellStart"/>
+      <w:r>
+        <w:rPr>
+          <w:rFonts w:ascii="Arial" w:hAnsi="Arial" w:cs="Arial"/>
+        </w:rPr>
+        <w:t>stop_times</w:t>
+      </w:r>
+      <w:proofErr w:type="spellEnd"/>
+      <w:r>
+        <w:rPr>
+          <w:rFonts w:ascii="Arial" w:hAnsi="Arial" w:cs="Arial"/>
+        </w:rPr>
+        <w:t xml:space="preserve"> </w:t>
+      </w:r>
+      <w:r>
+        <w:rPr>
+          <w:rFonts w:ascii="Arial" w:hAnsi="Arial" w:cs="Arial"/>
+        </w:rPr>
+        <w:sym w:font="Wingdings" w:char="F0E0"/>
+      </w:r>
+      <w:r>
+        <w:rPr>
+          <w:rFonts w:ascii="Arial" w:hAnsi="Arial" w:cs="Arial"/>
+        </w:rPr>
+        <w:t xml:space="preserve"> creació de </w:t>
+      </w:r>
+      <w:proofErr w:type="spellStart"/>
+      <w:r>
+        <w:rPr>
+          <w:rFonts w:ascii="Arial" w:hAnsi="Arial" w:cs="Arial"/>
+        </w:rPr>
+        <w:t>stop_times_cleaned</w:t>
+      </w:r>
+      <w:proofErr w:type="spellEnd"/>
+      <w:r>
+        <w:rPr>
+          <w:rFonts w:ascii="Arial" w:hAnsi="Arial" w:cs="Arial"/>
+        </w:rPr>
+        <w:t xml:space="preserve"> i </w:t>
+      </w:r>
+      <w:proofErr w:type="spellStart"/>
+      <w:r>
+        <w:rPr>
+          <w:rFonts w:ascii="Arial" w:hAnsi="Arial" w:cs="Arial"/>
+        </w:rPr>
+        <w:t>trips_cleaned</w:t>
+      </w:r>
+      <w:proofErr w:type="spellEnd"/>
+    </w:p>
+    <w:p>
+      <w:pPr>
+        <w:numPr>
+          <w:ilvl w:val="1"/>
+          <w:numId w:val="1"/>
+        </w:numPr>
+        <w:spacing w:line="278" w:lineRule="auto"/>
+        <w:rPr>
+          <w:rFonts w:ascii="Arial" w:hAnsi="Arial" w:cs="Arial"/>
+        </w:rPr>
+      </w:pPr>
+      <w:proofErr w:type="spellStart"/>
+      <w:r>
+        <w:rPr>
+          <w:rFonts w:ascii="Arial" w:hAnsi="Arial" w:cs="Arial"/>
+        </w:rPr>
+        <w:t>Stop_sequence</w:t>
+      </w:r>
+      <w:proofErr w:type="spellEnd"/>
+      <w:r>
+        <w:rPr>
+          <w:rFonts w:ascii="Arial" w:hAnsi="Arial" w:cs="Arial"/>
+        </w:rPr>
+        <w:t xml:space="preserve"> sempre s’incrementa d’un en un</w:t>
+      </w:r>
+    </w:p>
+    <w:p>
+      <w:pPr>
+        <w:numPr>
+          <w:ilvl w:val="0"/>
+          <w:numId w:val="1"/>
+        </w:numPr>
+        <w:spacing w:line="278" w:lineRule="auto"/>
+        <w:rPr>
+          <w:rFonts w:ascii="Arial" w:hAnsi="Arial" w:cs="Arial"/>
+        </w:rPr>
+      </w:pPr>
+      <w:r>
+        <w:rPr>
+          <w:rFonts w:ascii="Arial" w:hAnsi="Arial" w:cs="Arial"/>
+        </w:rPr>
+        <w:t>Comprovacions de trips</w:t>
+      </w:r>
+    </w:p>
+    <w:p>
+      <w:pPr>
+        <w:numPr>
+          <w:ilvl w:val="1"/>
+          <w:numId w:val="1"/>
+        </w:numPr>
+        <w:spacing w:line="278" w:lineRule="auto"/>
+        <w:rPr>
+          <w:rFonts w:ascii="Arial" w:hAnsi="Arial" w:cs="Arial"/>
+        </w:rPr>
+      </w:pPr>
+      <w:r>
+        <w:rPr>
+          <w:rFonts w:ascii="Arial" w:hAnsi="Arial" w:cs="Arial"/>
+        </w:rPr>
+        <w:t>Per cada “</w:t>
+      </w:r>
+      <w:proofErr w:type="spellStart"/>
+      <w:r>
+        <w:rPr>
+          <w:rFonts w:ascii="Arial" w:hAnsi="Arial" w:cs="Arial"/>
+        </w:rPr>
+        <w:t>route_id</w:t>
+      </w:r>
+      <w:proofErr w:type="spellEnd"/>
+      <w:r>
+        <w:rPr>
+          <w:rFonts w:ascii="Arial" w:hAnsi="Arial" w:cs="Arial"/>
+        </w:rPr>
+        <w:t>” tenim dues parelles disjuntes de (“</w:t>
+      </w:r>
+      <w:proofErr w:type="spellStart"/>
+      <w:r>
+        <w:rPr>
+          <w:rFonts w:ascii="Arial" w:hAnsi="Arial" w:cs="Arial"/>
+        </w:rPr>
+        <w:t>trip_headsign</w:t>
+      </w:r>
+      <w:proofErr w:type="spellEnd"/>
+      <w:r>
+        <w:rPr>
+          <w:rFonts w:ascii="Arial" w:hAnsi="Arial" w:cs="Arial"/>
+        </w:rPr>
+        <w:t>”, “</w:t>
+      </w:r>
+      <w:proofErr w:type="spellStart"/>
+      <w:r>
+        <w:rPr>
+          <w:rFonts w:ascii="Arial" w:hAnsi="Arial" w:cs="Arial"/>
+        </w:rPr>
+        <w:t>direction_id</w:t>
+      </w:r>
+      <w:proofErr w:type="spellEnd"/>
+      <w:r>
+        <w:rPr>
+          <w:rFonts w:ascii="Arial" w:hAnsi="Arial" w:cs="Arial"/>
+        </w:rPr>
+        <w:t>”). És a dir, per identificar la direcció dels viatges podem utilitzar ambdues</w:t>
       </w:r>
     </w:p>
     <w:sectPr>
@@ -60,6 +805,127 @@
     </w:sectPr>
   </w:body>
 </w:document>
+</file>
+
+<file path=word/numbering.xml><?xml version="1.0" encoding="utf-8"?>
+<w:numbering xmlns:wpc="http://schemas.microsoft.com/office/word/2010/wordprocessingCanvas" xmlns:cx="http://schemas.microsoft.com/office/drawing/2014/chartex" xmlns:cx1="http://schemas.microsoft.com/office/drawing/2015/9/8/chartex" xmlns:cx2="http://schemas.microsoft.com/office/drawing/2015/10/21/chartex" xmlns:cx3="http://schemas.microsoft.com/office/drawing/2016/5/9/chartex" xmlns:cx4="http://schemas.microsoft.com/office/drawing/2016/5/10/chartex" xmlns:cx5="http://schemas.microsoft.com/office/drawing/2016/5/11/chartex" xmlns:cx6="http://schemas.microsoft.com/office/drawing/2016/5/12/chartex" xmlns:cx7="http://schemas.microsoft.com/office/drawing/2016/5/13/chartex" xmlns:cx8="http://schemas.microsoft.com/office/drawing/2016/5/14/chartex" xmlns:mc="http://schemas.openxmlformats.org/markup-compatibility/2006" xmlns:aink="http://schemas.microsoft.com/office/drawing/2016/ink" xmlns:am3d="http://schemas.microsoft.com/office/drawing/2017/model3d" xmlns:o="urn:schemas-microsoft-com:office:office" xmlns:oel="http://schemas.microsoft.com/office/2019/extlst" xmlns:r="http://schemas.openxmlformats.org/officeDocument/2006/relationships" xmlns:m="http://schemas.openxmlformats.org/officeDocument/2006/math" xmlns:v="urn:schemas-microsoft-com:vml" xmlns:wp14="http://schemas.microsoft.com/office/word/2010/wordprocessingDrawing" xmlns:wp="http://schemas.openxmlformats.org/drawingml/2006/wordprocessingDrawing" xmlns:w10="urn:schemas-microsoft-com:office:word" xmlns:w="http://schemas.openxmlformats.org/wordprocessingml/2006/main" xmlns:w14="http://schemas.microsoft.com/office/word/2010/wordml" xmlns:w15="http://schemas.microsoft.com/office/word/2012/wordml" xmlns:w16cex="http://schemas.microsoft.com/office/word/2018/wordml/cex" xmlns:w16cid="http://schemas.microsoft.com/office/word/2016/wordml/cid" xmlns:w16="http://schemas.microsoft.com/office/word/2018/wordml" xmlns:w16du="http://schemas.microsoft.com/office/word/2023/wordml/word16du" xmlns:w16sdtdh="http://schemas.microsoft.com/office/word/2020/wordml/sdtdatahash" xmlns:w16sdtfl="http://schemas.microsoft.com/office/word/2024/wordml/sdtformatlock" xmlns:w16se="http://schemas.microsoft.com/office/word/2015/wordml/symex" xmlns:wpg="http://schemas.microsoft.com/office/word/2010/wordprocessingGroup" xmlns:wpi="http://schemas.microsoft.com/office/word/2010/wordprocessingInk" xmlns:wne="http://schemas.microsoft.com/office/word/2006/wordml" xmlns:wps="http://schemas.microsoft.com/office/word/2010/wordprocessingShape" mc:Ignorable="w14 w15 w16se w16cid w16 w16cex w16sdtdh w16sdtfl w16du wp14">
+  <w:abstractNum w:abstractNumId="0" w15:restartNumberingAfterBreak="0">
+    <w:nsid w:val="0F2825F8"/>
+    <w:multiLevelType w:val="hybridMultilevel"/>
+    <w:tmpl w:val="FFFFFFFF"/>
+    <w:lvl w:ilvl="0" w:tplc="07E07112">
+      <w:start w:val="1"/>
+      <w:numFmt w:val="bullet"/>
+      <w:lvlText w:val="-"/>
+      <w:lvlJc w:val="left"/>
+      <w:pPr>
+        <w:ind w:left="720" w:hanging="360"/>
+      </w:pPr>
+      <w:rPr>
+        <w:rFonts w:ascii="Arial" w:eastAsiaTheme="minorEastAsia" w:hAnsi="Arial" w:hint="default"/>
+      </w:rPr>
+    </w:lvl>
+    <w:lvl w:ilvl="1" w:tplc="0C0A0003">
+      <w:start w:val="1"/>
+      <w:numFmt w:val="bullet"/>
+      <w:lvlText w:val="o"/>
+      <w:lvlJc w:val="left"/>
+      <w:pPr>
+        <w:ind w:left="1440" w:hanging="360"/>
+      </w:pPr>
+      <w:rPr>
+        <w:rFonts w:ascii="Courier New" w:hAnsi="Courier New" w:hint="default"/>
+      </w:rPr>
+    </w:lvl>
+    <w:lvl w:ilvl="2" w:tplc="0C0A0005" w:tentative="1">
+      <w:start w:val="1"/>
+      <w:numFmt w:val="bullet"/>
+      <w:lvlText w:val=""/>
+      <w:lvlJc w:val="left"/>
+      <w:pPr>
+        <w:ind w:left="2160" w:hanging="360"/>
+      </w:pPr>
+      <w:rPr>
+        <w:rFonts w:ascii="Wingdings" w:hAnsi="Wingdings" w:hint="default"/>
+      </w:rPr>
+    </w:lvl>
+    <w:lvl w:ilvl="3" w:tplc="0C0A0001" w:tentative="1">
+      <w:start w:val="1"/>
+      <w:numFmt w:val="bullet"/>
+      <w:lvlText w:val=""/>
+      <w:lvlJc w:val="left"/>
+      <w:pPr>
+        <w:ind w:left="2880" w:hanging="360"/>
+      </w:pPr>
+      <w:rPr>
+        <w:rFonts w:ascii="Symbol" w:hAnsi="Symbol" w:hint="default"/>
+      </w:rPr>
+    </w:lvl>
+    <w:lvl w:ilvl="4" w:tplc="0C0A0003" w:tentative="1">
+      <w:start w:val="1"/>
+      <w:numFmt w:val="bullet"/>
+      <w:lvlText w:val="o"/>
+      <w:lvlJc w:val="left"/>
+      <w:pPr>
+        <w:ind w:left="3600" w:hanging="360"/>
+      </w:pPr>
+      <w:rPr>
+        <w:rFonts w:ascii="Courier New" w:hAnsi="Courier New" w:hint="default"/>
+      </w:rPr>
+    </w:lvl>
+    <w:lvl w:ilvl="5" w:tplc="0C0A0005" w:tentative="1">
+      <w:start w:val="1"/>
+      <w:numFmt w:val="bullet"/>
+      <w:lvlText w:val=""/>
+      <w:lvlJc w:val="left"/>
+      <w:pPr>
+        <w:ind w:left="4320" w:hanging="360"/>
+      </w:pPr>
+      <w:rPr>
+        <w:rFonts w:ascii="Wingdings" w:hAnsi="Wingdings" w:hint="default"/>
+      </w:rPr>
+    </w:lvl>
+    <w:lvl w:ilvl="6" w:tplc="0C0A0001" w:tentative="1">
+      <w:start w:val="1"/>
+      <w:numFmt w:val="bullet"/>
+      <w:lvlText w:val=""/>
+      <w:lvlJc w:val="left"/>
+      <w:pPr>
+        <w:ind w:left="5040" w:hanging="360"/>
+      </w:pPr>
+      <w:rPr>
+        <w:rFonts w:ascii="Symbol" w:hAnsi="Symbol" w:hint="default"/>
+      </w:rPr>
+    </w:lvl>
+    <w:lvl w:ilvl="7" w:tplc="0C0A0003" w:tentative="1">
+      <w:start w:val="1"/>
+      <w:numFmt w:val="bullet"/>
+      <w:lvlText w:val="o"/>
+      <w:lvlJc w:val="left"/>
+      <w:pPr>
+        <w:ind w:left="5760" w:hanging="360"/>
+      </w:pPr>
+      <w:rPr>
+        <w:rFonts w:ascii="Courier New" w:hAnsi="Courier New" w:hint="default"/>
+      </w:rPr>
+    </w:lvl>
+    <w:lvl w:ilvl="8" w:tplc="0C0A0005" w:tentative="1">
+      <w:start w:val="1"/>
+      <w:numFmt w:val="bullet"/>
+      <w:lvlText w:val=""/>
+      <w:lvlJc w:val="left"/>
+      <w:pPr>
+        <w:ind w:left="6480" w:hanging="360"/>
+      </w:pPr>
+      <w:rPr>
+        <w:rFonts w:ascii="Wingdings" w:hAnsi="Wingdings" w:hint="default"/>
+      </w:rPr>
+    </w:lvl>
+  </w:abstractNum>
+  <w:num w:numId="1" w16cid:durableId="1219512179">
+    <w:abstractNumId w:val="0"/>
+  </w:num>
+</w:numbering>
 </file>
 
 <file path=word/styles.xml><?xml version="1.0" encoding="utf-8"?>

</xml_diff>

<commit_message>
Add Liceu case documentation and enhance stops_ids_names script with entrance handling
</commit_message>
<xml_diff>
--- a/documentation/data.docx
+++ b/documentation/data.docx
@@ -50,77 +50,101 @@
           <w:sz w:val="24"/>
           <w:szCs w:val="24"/>
         </w:rPr>
-        <w:t>La columna de “</w:t>
-      </w:r>
-      <w:proofErr w:type="spellStart"/>
+        <w:t>La columna de “signposted_as” de “pathways” es podria utilitzar per donar indicacions del trajecte (pels transbords i les sortides). COMPTE: aquests comentaris estan en català i no els traduiré pel repositori (</w:t>
+      </w:r>
       <w:r>
         <w:rPr>
           <w:rFonts w:ascii="Arial" w:hAnsi="Arial" w:cs="Arial"/>
           <w:sz w:val="24"/>
           <w:szCs w:val="24"/>
         </w:rPr>
-        <w:t>signposted_as</w:t>
-      </w:r>
-      <w:proofErr w:type="spellEnd"/>
+        <w:sym w:font="Wingdings" w:char="F0DF"/>
+      </w:r>
       <w:r>
         <w:rPr>
           <w:rFonts w:ascii="Arial" w:hAnsi="Arial" w:cs="Arial"/>
           <w:sz w:val="24"/>
           <w:szCs w:val="24"/>
         </w:rPr>
-        <w:t>” de “</w:t>
-      </w:r>
-      <w:proofErr w:type="spellStart"/>
-      <w:r>
+        <w:t xml:space="preserve"> es podria fer perquè realment hi ha un nombre finit de paraules que no són noms propis com accés, correspondència, sortida per, etc.).</w:t>
+      </w:r>
+    </w:p>
+    <w:p>
+      <w:pPr>
         <w:rPr>
           <w:rFonts w:ascii="Arial" w:hAnsi="Arial" w:cs="Arial"/>
           <w:sz w:val="24"/>
           <w:szCs w:val="24"/>
         </w:rPr>
-        <w:t>pathways</w:t>
-      </w:r>
-      <w:proofErr w:type="spellEnd"/>
-      <w:r>
+      </w:pPr>
+    </w:p>
+    <w:p>
+      <w:pPr>
         <w:rPr>
           <w:rFonts w:ascii="Arial" w:hAnsi="Arial" w:cs="Arial"/>
           <w:sz w:val="24"/>
           <w:szCs w:val="24"/>
         </w:rPr>
-        <w:t xml:space="preserve">” es podria utilitzar per donar indicacions del trajecte (pels transbords i les sortides). COMPTE: aquests comentaris estan en català i no els traduiré pel </w:t>
-      </w:r>
-      <w:proofErr w:type="spellStart"/>
+      </w:pPr>
       <w:r>
         <w:rPr>
           <w:rFonts w:ascii="Arial" w:hAnsi="Arial" w:cs="Arial"/>
           <w:sz w:val="24"/>
           <w:szCs w:val="24"/>
         </w:rPr>
-        <w:t>repositori</w:t>
-      </w:r>
-      <w:proofErr w:type="spellEnd"/>
+        <w:t xml:space="preserve">Cas Ernest Lluch explicat </w:t>
+      </w:r>
+      <w:hyperlink r:id="rId5" w:history="1">
+        <w:r>
+          <w:rPr>
+            <w:rStyle w:val="Hipervnculo"/>
+            <w:rFonts w:ascii="Arial" w:hAnsi="Arial" w:cs="Arial"/>
+            <w:sz w:val="24"/>
+            <w:szCs w:val="24"/>
+          </w:rPr>
+          <w:t>aquí</w:t>
+        </w:r>
+      </w:hyperlink>
       <w:r>
         <w:rPr>
           <w:rFonts w:ascii="Arial" w:hAnsi="Arial" w:cs="Arial"/>
           <w:sz w:val="24"/>
           <w:szCs w:val="24"/>
         </w:rPr>
-        <w:t xml:space="preserve"> (</w:t>
-      </w:r>
-      <w:r>
+        <w:t>.</w:t>
+      </w:r>
+    </w:p>
+    <w:p>
+      <w:pPr>
         <w:rPr>
           <w:rFonts w:ascii="Arial" w:hAnsi="Arial" w:cs="Arial"/>
           <w:sz w:val="24"/>
           <w:szCs w:val="24"/>
         </w:rPr>
-        <w:sym w:font="Wingdings" w:char="F0DF"/>
-      </w:r>
+      </w:pPr>
       <w:r>
         <w:rPr>
           <w:rFonts w:ascii="Arial" w:hAnsi="Arial" w:cs="Arial"/>
           <w:sz w:val="24"/>
           <w:szCs w:val="24"/>
         </w:rPr>
-        <w:t xml:space="preserve"> es podria fer perquè realment hi ha un nombre finit de paraules que no són noms propis com accés, correspondència, sortida per, etc.).</w:t>
+        <w:t xml:space="preserve">Cas Liceu explicat a </w:t>
+      </w:r>
+      <w:r>
+        <w:rPr>
+          <w:rFonts w:ascii="Arial" w:hAnsi="Arial" w:cs="Arial"/>
+          <w:sz w:val="24"/>
+          <w:szCs w:val="24"/>
+        </w:rPr>
+        <w:t>.work\05.10.docx</w:t>
+      </w:r>
+      <w:r>
+        <w:rPr>
+          <w:rFonts w:ascii="Arial" w:hAnsi="Arial" w:cs="Arial"/>
+          <w:sz w:val="24"/>
+          <w:szCs w:val="24"/>
+        </w:rPr>
+        <w:t>.</w:t>
       </w:r>
     </w:p>
     <w:p>
@@ -210,49 +234,7 @@
         <w:rPr>
           <w:rFonts w:ascii="Arial" w:hAnsi="Arial" w:cs="Arial"/>
         </w:rPr>
-        <w:t xml:space="preserve">Totes les </w:t>
-      </w:r>
-      <w:proofErr w:type="spellStart"/>
-      <w:r>
-        <w:rPr>
-          <w:rFonts w:ascii="Arial" w:hAnsi="Arial" w:cs="Arial"/>
-        </w:rPr>
-        <w:t>stop_id</w:t>
-      </w:r>
-      <w:proofErr w:type="spellEnd"/>
-      <w:r>
-        <w:rPr>
-          <w:rFonts w:ascii="Arial" w:hAnsi="Arial" w:cs="Arial"/>
-        </w:rPr>
-        <w:t xml:space="preserve"> de </w:t>
-      </w:r>
-      <w:proofErr w:type="spellStart"/>
-      <w:r>
-        <w:rPr>
-          <w:rFonts w:ascii="Arial" w:hAnsi="Arial" w:cs="Arial"/>
-        </w:rPr>
-        <w:t>pathways</w:t>
-      </w:r>
-      <w:proofErr w:type="spellEnd"/>
-      <w:r>
-        <w:rPr>
-          <w:rFonts w:ascii="Arial" w:hAnsi="Arial" w:cs="Arial"/>
-        </w:rPr>
-        <w:t xml:space="preserve"> i </w:t>
-      </w:r>
-      <w:proofErr w:type="spellStart"/>
-      <w:r>
-        <w:rPr>
-          <w:rFonts w:ascii="Arial" w:hAnsi="Arial" w:cs="Arial"/>
-        </w:rPr>
-        <w:t>stop_times</w:t>
-      </w:r>
-      <w:proofErr w:type="spellEnd"/>
-      <w:r>
-        <w:rPr>
-          <w:rFonts w:ascii="Arial" w:hAnsi="Arial" w:cs="Arial"/>
-        </w:rPr>
-        <w:t xml:space="preserve"> estan a stops</w:t>
+        <w:t>Totes les stop_id de pathways i stop_times estan a stops</w:t>
       </w:r>
     </w:p>
     <w:p>
@@ -270,30 +252,8 @@
         <w:rPr>
           <w:rFonts w:ascii="Arial" w:hAnsi="Arial" w:cs="Arial"/>
         </w:rPr>
-        <w:t xml:space="preserve">Tot </w:t>
-      </w:r>
-      <w:proofErr w:type="spellStart"/>
-      <w:r>
-        <w:rPr>
-          <w:rFonts w:ascii="Arial" w:hAnsi="Arial" w:cs="Arial"/>
-        </w:rPr>
-        <w:t>route_id</w:t>
-      </w:r>
-      <w:proofErr w:type="spellEnd"/>
-      <w:r>
-        <w:rPr>
-          <w:rFonts w:ascii="Arial" w:hAnsi="Arial" w:cs="Arial"/>
-        </w:rPr>
-        <w:t xml:space="preserve"> de trips està a </w:t>
-      </w:r>
-      <w:proofErr w:type="spellStart"/>
-      <w:r>
-        <w:rPr>
-          <w:rFonts w:ascii="Arial" w:hAnsi="Arial" w:cs="Arial"/>
-        </w:rPr>
-        <w:t>routes</w:t>
-      </w:r>
-      <w:proofErr w:type="spellEnd"/>
+        <w:t>Tot route_id de trips està a routes</w:t>
+      </w:r>
     </w:p>
     <w:p>
       <w:pPr>
@@ -310,35 +270,7 @@
         <w:rPr>
           <w:rFonts w:ascii="Arial" w:hAnsi="Arial" w:cs="Arial"/>
         </w:rPr>
-        <w:t xml:space="preserve">Tot </w:t>
-      </w:r>
-      <w:proofErr w:type="spellStart"/>
-      <w:r>
-        <w:rPr>
-          <w:rFonts w:ascii="Arial" w:hAnsi="Arial" w:cs="Arial"/>
-        </w:rPr>
-        <w:t>trip_id</w:t>
-      </w:r>
-      <w:proofErr w:type="spellEnd"/>
-      <w:r>
-        <w:rPr>
-          <w:rFonts w:ascii="Arial" w:hAnsi="Arial" w:cs="Arial"/>
-        </w:rPr>
-        <w:t xml:space="preserve"> de </w:t>
-      </w:r>
-      <w:proofErr w:type="spellStart"/>
-      <w:r>
-        <w:rPr>
-          <w:rFonts w:ascii="Arial" w:hAnsi="Arial" w:cs="Arial"/>
-        </w:rPr>
-        <w:t>stops_times</w:t>
-      </w:r>
-      <w:proofErr w:type="spellEnd"/>
-      <w:r>
-        <w:rPr>
-          <w:rFonts w:ascii="Arial" w:hAnsi="Arial" w:cs="Arial"/>
-        </w:rPr>
-        <w:t xml:space="preserve"> està a trips</w:t>
+        <w:t>Tot trip_id de stops_times està a trips</w:t>
       </w:r>
     </w:p>
     <w:p>
@@ -356,16 +288,8 @@
         <w:rPr>
           <w:rFonts w:ascii="Arial" w:hAnsi="Arial" w:cs="Arial"/>
         </w:rPr>
-        <w:t xml:space="preserve">Comprovacions de </w:t>
-      </w:r>
-      <w:proofErr w:type="spellStart"/>
-      <w:r>
-        <w:rPr>
-          <w:rFonts w:ascii="Arial" w:hAnsi="Arial" w:cs="Arial"/>
-        </w:rPr>
-        <w:t>pathways</w:t>
-      </w:r>
-      <w:proofErr w:type="spellEnd"/>
+        <w:t>Comprovacions de pathways</w:t>
+      </w:r>
     </w:p>
     <w:p>
       <w:pPr>
@@ -378,28 +302,12 @@
           <w:rFonts w:ascii="Arial" w:hAnsi="Arial" w:cs="Arial"/>
         </w:rPr>
       </w:pPr>
-      <w:proofErr w:type="spellStart"/>
-      <w:r>
-        <w:rPr>
-          <w:rFonts w:ascii="Arial" w:hAnsi="Arial" w:cs="Arial"/>
-        </w:rPr>
-        <w:t>Transfers</w:t>
-      </w:r>
-      <w:proofErr w:type="spellEnd"/>
-      <w:r>
-        <w:rPr>
-          <w:rFonts w:ascii="Arial" w:hAnsi="Arial" w:cs="Arial"/>
-        </w:rPr>
-        <w:t xml:space="preserve"> inclòs a </w:t>
-      </w:r>
-      <w:proofErr w:type="spellStart"/>
-      <w:r>
-        <w:rPr>
-          <w:rFonts w:ascii="Arial" w:hAnsi="Arial" w:cs="Arial"/>
-        </w:rPr>
-        <w:t>pathways</w:t>
-      </w:r>
-      <w:proofErr w:type="spellEnd"/>
+      <w:r>
+        <w:rPr>
+          <w:rFonts w:ascii="Arial" w:hAnsi="Arial" w:cs="Arial"/>
+        </w:rPr>
+        <w:t>Transfers inclòs a pathways</w:t>
+      </w:r>
       <w:r>
         <w:rPr>
           <w:rFonts w:ascii="Arial" w:hAnsi="Arial" w:cs="Arial"/>
@@ -422,21 +330,7 @@
         <w:rPr>
           <w:rFonts w:ascii="Arial" w:hAnsi="Arial" w:cs="Arial"/>
         </w:rPr>
-        <w:t xml:space="preserve">A </w:t>
-      </w:r>
-      <w:proofErr w:type="spellStart"/>
-      <w:r>
-        <w:rPr>
-          <w:rFonts w:ascii="Arial" w:hAnsi="Arial" w:cs="Arial"/>
-        </w:rPr>
-        <w:t>pathways</w:t>
-      </w:r>
-      <w:proofErr w:type="spellEnd"/>
-      <w:r>
-        <w:rPr>
-          <w:rFonts w:ascii="Arial" w:hAnsi="Arial" w:cs="Arial"/>
-        </w:rPr>
-        <w:t xml:space="preserve"> existeixen sempre les combinacions dels dos sentits</w:t>
+        <w:t>A pathways existeixen sempre les combinacions dels dos sentits</w:t>
       </w:r>
       <w:r>
         <w:rPr>
@@ -468,19 +362,11 @@
           <w:rFonts w:ascii="Arial" w:hAnsi="Arial" w:cs="Arial"/>
         </w:rPr>
       </w:pPr>
-      <w:proofErr w:type="spellStart"/>
-      <w:r>
-        <w:rPr>
-          <w:rFonts w:ascii="Arial" w:hAnsi="Arial" w:cs="Arial"/>
-        </w:rPr>
-        <w:t>Traversal_time</w:t>
-      </w:r>
-      <w:proofErr w:type="spellEnd"/>
-      <w:r>
-        <w:rPr>
-          <w:rFonts w:ascii="Arial" w:hAnsi="Arial" w:cs="Arial"/>
-        </w:rPr>
-        <w:t xml:space="preserve"> igual pels dos sentits (excepte quan no hi ha un sentit </w:t>
+      <w:r>
+        <w:rPr>
+          <w:rFonts w:ascii="Arial" w:hAnsi="Arial" w:cs="Arial"/>
+        </w:rPr>
+        <w:t xml:space="preserve">Traversal_time igual pels dos sentits (excepte quan no hi ha un sentit </w:t>
       </w:r>
       <w:r>
         <w:rPr>
@@ -506,19 +392,11 @@
           <w:rFonts w:ascii="Arial" w:hAnsi="Arial" w:cs="Arial"/>
         </w:rPr>
       </w:pPr>
-      <w:proofErr w:type="spellStart"/>
-      <w:r>
-        <w:rPr>
-          <w:rFonts w:ascii="Arial" w:hAnsi="Arial" w:cs="Arial"/>
-        </w:rPr>
-        <w:t>Traversal_time</w:t>
-      </w:r>
-      <w:proofErr w:type="spellEnd"/>
-      <w:r>
-        <w:rPr>
-          <w:rFonts w:ascii="Arial" w:hAnsi="Arial" w:cs="Arial"/>
-        </w:rPr>
-        <w:t xml:space="preserve"> múltiple de 15 (només curiositat) </w:t>
+      <w:r>
+        <w:rPr>
+          <w:rFonts w:ascii="Arial" w:hAnsi="Arial" w:cs="Arial"/>
+        </w:rPr>
+        <w:t xml:space="preserve">Traversal_time múltiple de 15 (només curiositat) </w:t>
       </w:r>
     </w:p>
     <w:p>
@@ -602,16 +480,8 @@
         <w:rPr>
           <w:rFonts w:ascii="Arial" w:hAnsi="Arial" w:cs="Arial"/>
         </w:rPr>
-        <w:t xml:space="preserve">Comprovacions de </w:t>
-      </w:r>
-      <w:proofErr w:type="spellStart"/>
-      <w:r>
-        <w:rPr>
-          <w:rFonts w:ascii="Arial" w:hAnsi="Arial" w:cs="Arial"/>
-        </w:rPr>
-        <w:t>stop_times</w:t>
-      </w:r>
-      <w:proofErr w:type="spellEnd"/>
+        <w:t>Comprovacions de stop_times</w:t>
+      </w:r>
     </w:p>
     <w:p>
       <w:pPr>
@@ -628,35 +498,7 @@
         <w:rPr>
           <w:rFonts w:ascii="Arial" w:hAnsi="Arial" w:cs="Arial"/>
         </w:rPr>
-        <w:t xml:space="preserve">Repeticions de blocs de </w:t>
-      </w:r>
-      <w:proofErr w:type="spellStart"/>
-      <w:r>
-        <w:rPr>
-          <w:rFonts w:ascii="Arial" w:hAnsi="Arial" w:cs="Arial"/>
-        </w:rPr>
-        <w:t>trip_id</w:t>
-      </w:r>
-      <w:proofErr w:type="spellEnd"/>
-      <w:r>
-        <w:rPr>
-          <w:rFonts w:ascii="Arial" w:hAnsi="Arial" w:cs="Arial"/>
-        </w:rPr>
-        <w:t xml:space="preserve"> sencers a </w:t>
-      </w:r>
-      <w:proofErr w:type="spellStart"/>
-      <w:r>
-        <w:rPr>
-          <w:rFonts w:ascii="Arial" w:hAnsi="Arial" w:cs="Arial"/>
-        </w:rPr>
-        <w:t>stop_times</w:t>
-      </w:r>
-      <w:proofErr w:type="spellEnd"/>
-      <w:r>
-        <w:rPr>
-          <w:rFonts w:ascii="Arial" w:hAnsi="Arial" w:cs="Arial"/>
-        </w:rPr>
-        <w:t xml:space="preserve"> </w:t>
+        <w:t xml:space="preserve">Repeticions de blocs de trip_id sencers a stop_times </w:t>
       </w:r>
       <w:r>
         <w:rPr>
@@ -668,30 +510,8 @@
         <w:rPr>
           <w:rFonts w:ascii="Arial" w:hAnsi="Arial" w:cs="Arial"/>
         </w:rPr>
-        <w:t xml:space="preserve"> creació de </w:t>
-      </w:r>
-      <w:proofErr w:type="spellStart"/>
-      <w:r>
-        <w:rPr>
-          <w:rFonts w:ascii="Arial" w:hAnsi="Arial" w:cs="Arial"/>
-        </w:rPr>
-        <w:t>stop_times_cleaned</w:t>
-      </w:r>
-      <w:proofErr w:type="spellEnd"/>
-      <w:r>
-        <w:rPr>
-          <w:rFonts w:ascii="Arial" w:hAnsi="Arial" w:cs="Arial"/>
-        </w:rPr>
-        <w:t xml:space="preserve"> i </w:t>
-      </w:r>
-      <w:proofErr w:type="spellStart"/>
-      <w:r>
-        <w:rPr>
-          <w:rFonts w:ascii="Arial" w:hAnsi="Arial" w:cs="Arial"/>
-        </w:rPr>
-        <w:t>trips_cleaned</w:t>
-      </w:r>
-      <w:proofErr w:type="spellEnd"/>
+        <w:t xml:space="preserve"> creació de stop_times_cleaned i trips_cleaned</w:t>
+      </w:r>
     </w:p>
     <w:p>
       <w:pPr>
@@ -704,19 +524,11 @@
           <w:rFonts w:ascii="Arial" w:hAnsi="Arial" w:cs="Arial"/>
         </w:rPr>
       </w:pPr>
-      <w:proofErr w:type="spellStart"/>
-      <w:r>
-        <w:rPr>
-          <w:rFonts w:ascii="Arial" w:hAnsi="Arial" w:cs="Arial"/>
-        </w:rPr>
-        <w:t>Stop_sequence</w:t>
-      </w:r>
-      <w:proofErr w:type="spellEnd"/>
-      <w:r>
-        <w:rPr>
-          <w:rFonts w:ascii="Arial" w:hAnsi="Arial" w:cs="Arial"/>
-        </w:rPr>
-        <w:t xml:space="preserve"> sempre s’incrementa d’un en un</w:t>
+      <w:r>
+        <w:rPr>
+          <w:rFonts w:ascii="Arial" w:hAnsi="Arial" w:cs="Arial"/>
+        </w:rPr>
+        <w:t>Stop_sequence sempre s’incrementa d’un en un</w:t>
       </w:r>
     </w:p>
     <w:p>
@@ -734,6 +546,7 @@
         <w:rPr>
           <w:rFonts w:ascii="Arial" w:hAnsi="Arial" w:cs="Arial"/>
         </w:rPr>
+        <w:lastRenderedPageBreak/>
         <w:t>Comprovacions de trips</w:t>
       </w:r>
     </w:p>
@@ -752,49 +565,7 @@
         <w:rPr>
           <w:rFonts w:ascii="Arial" w:hAnsi="Arial" w:cs="Arial"/>
         </w:rPr>
-        <w:t>Per cada “</w:t>
-      </w:r>
-      <w:proofErr w:type="spellStart"/>
-      <w:r>
-        <w:rPr>
-          <w:rFonts w:ascii="Arial" w:hAnsi="Arial" w:cs="Arial"/>
-        </w:rPr>
-        <w:t>route_id</w:t>
-      </w:r>
-      <w:proofErr w:type="spellEnd"/>
-      <w:r>
-        <w:rPr>
-          <w:rFonts w:ascii="Arial" w:hAnsi="Arial" w:cs="Arial"/>
-        </w:rPr>
-        <w:t>” tenim dues parelles disjuntes de (“</w:t>
-      </w:r>
-      <w:proofErr w:type="spellStart"/>
-      <w:r>
-        <w:rPr>
-          <w:rFonts w:ascii="Arial" w:hAnsi="Arial" w:cs="Arial"/>
-        </w:rPr>
-        <w:t>trip_headsign</w:t>
-      </w:r>
-      <w:proofErr w:type="spellEnd"/>
-      <w:r>
-        <w:rPr>
-          <w:rFonts w:ascii="Arial" w:hAnsi="Arial" w:cs="Arial"/>
-        </w:rPr>
-        <w:t>”, “</w:t>
-      </w:r>
-      <w:proofErr w:type="spellStart"/>
-      <w:r>
-        <w:rPr>
-          <w:rFonts w:ascii="Arial" w:hAnsi="Arial" w:cs="Arial"/>
-        </w:rPr>
-        <w:t>direction_id</w:t>
-      </w:r>
-      <w:proofErr w:type="spellEnd"/>
-      <w:r>
-        <w:rPr>
-          <w:rFonts w:ascii="Arial" w:hAnsi="Arial" w:cs="Arial"/>
-        </w:rPr>
-        <w:t>”). És a dir, per identificar la direcció dels viatges podem utilitzar ambdues</w:t>
+        <w:t>Per cada “route_id” tenim dues parelles disjuntes de (“trip_headsign”, “direction_id”). És a dir, per identificar la direcció dels viatges podem utilitzar ambdues</w:t>
       </w:r>
     </w:p>
     <w:sectPr>
@@ -1861,6 +1632,29 @@
       <w:spacing w:val="5"/>
     </w:rPr>
   </w:style>
+  <w:style w:type="character" w:styleId="Hipervnculo">
+    <w:name w:val="Hyperlink"/>
+    <w:basedOn w:val="Fuentedeprrafopredeter"/>
+    <w:uiPriority w:val="99"/>
+    <w:unhideWhenUsed/>
+    <w:rsid w:val="00477272"/>
+    <w:rPr>
+      <w:color w:val="467886" w:themeColor="hyperlink"/>
+      <w:u w:val="single"/>
+    </w:rPr>
+  </w:style>
+  <w:style w:type="character" w:styleId="Mencinsinresolver">
+    <w:name w:val="Unresolved Mention"/>
+    <w:basedOn w:val="Fuentedeprrafopredeter"/>
+    <w:uiPriority w:val="99"/>
+    <w:semiHidden/>
+    <w:unhideWhenUsed/>
+    <w:rsid w:val="00477272"/>
+    <w:rPr>
+      <w:color w:val="605E5C"/>
+      <w:shd w:val="clear" w:color="auto" w:fill="E1DFDD"/>
+    </w:rPr>
+  </w:style>
 </w:styles>
 </file>
 

</xml_diff>

<commit_message>
Refactor and update project files
- Updated  to improve docstring validation for functions.
- Enhanced  to provide clearer output and updated requirements handling.
- Modified  to reflect updated package versions.
- Added new  script containing subway stop IDs.
- Refactored  to utilize the new  for stop ID management.
- Improved utility functions in  for better CSV handling.
- Added binary files to  for performance optimization.
</commit_message>
<xml_diff>
--- a/documentation/data.docx
+++ b/documentation/data.docx
@@ -33,24 +33,89 @@
           <w:szCs w:val="28"/>
           <w:u w:val="single"/>
         </w:rPr>
-        <w:t>ata</w:t>
-      </w:r>
-    </w:p>
-    <w:p>
-      <w:pPr>
-        <w:rPr>
-          <w:rFonts w:ascii="Arial" w:hAnsi="Arial" w:cs="Arial"/>
-          <w:sz w:val="24"/>
-          <w:szCs w:val="24"/>
-        </w:rPr>
-      </w:pPr>
-      <w:r>
-        <w:rPr>
-          <w:rFonts w:ascii="Arial" w:hAnsi="Arial" w:cs="Arial"/>
-          <w:sz w:val="24"/>
-          <w:szCs w:val="24"/>
-        </w:rPr>
-        <w:t>La columna de “signposted_as” de “pathways” es podria utilitzar per donar indicacions del trajecte (pels transbords i les sortides). COMPTE: aquests comentaris estan en català i no els traduiré pel repositori (</w:t>
+        <w:t>a</w:t>
+      </w:r>
+      <w:r>
+        <w:rPr>
+          <w:rFonts w:ascii="Arial" w:hAnsi="Arial" w:cs="Arial"/>
+          <w:b/>
+          <w:bCs/>
+          <w:sz w:val="28"/>
+          <w:szCs w:val="28"/>
+          <w:u w:val="single"/>
+        </w:rPr>
+        <w:t>des</w:t>
+      </w:r>
+    </w:p>
+    <w:p>
+      <w:pPr>
+        <w:rPr>
+          <w:rFonts w:ascii="Arial" w:hAnsi="Arial" w:cs="Arial"/>
+          <w:sz w:val="24"/>
+          <w:szCs w:val="24"/>
+        </w:rPr>
+      </w:pPr>
+      <w:r>
+        <w:rPr>
+          <w:rFonts w:ascii="Arial" w:hAnsi="Arial" w:cs="Arial"/>
+          <w:sz w:val="24"/>
+          <w:szCs w:val="24"/>
+        </w:rPr>
+        <w:t>La columna de “</w:t>
+      </w:r>
+      <w:proofErr w:type="spellStart"/>
+      <w:r>
+        <w:rPr>
+          <w:rFonts w:ascii="Arial" w:hAnsi="Arial" w:cs="Arial"/>
+          <w:sz w:val="24"/>
+          <w:szCs w:val="24"/>
+        </w:rPr>
+        <w:t>signposted_as</w:t>
+      </w:r>
+      <w:proofErr w:type="spellEnd"/>
+      <w:r>
+        <w:rPr>
+          <w:rFonts w:ascii="Arial" w:hAnsi="Arial" w:cs="Arial"/>
+          <w:sz w:val="24"/>
+          <w:szCs w:val="24"/>
+        </w:rPr>
+        <w:t>” de “</w:t>
+      </w:r>
+      <w:proofErr w:type="spellStart"/>
+      <w:r>
+        <w:rPr>
+          <w:rFonts w:ascii="Arial" w:hAnsi="Arial" w:cs="Arial"/>
+          <w:sz w:val="24"/>
+          <w:szCs w:val="24"/>
+        </w:rPr>
+        <w:t>pathways</w:t>
+      </w:r>
+      <w:proofErr w:type="spellEnd"/>
+      <w:r>
+        <w:rPr>
+          <w:rFonts w:ascii="Arial" w:hAnsi="Arial" w:cs="Arial"/>
+          <w:sz w:val="24"/>
+          <w:szCs w:val="24"/>
+        </w:rPr>
+        <w:t xml:space="preserve">” es podria utilitzar per donar indicacions del trajecte (pels transbords i les sortides). COMPTE: aquests comentaris estan en català i no els traduiré pel </w:t>
+      </w:r>
+      <w:proofErr w:type="spellStart"/>
+      <w:r>
+        <w:rPr>
+          <w:rFonts w:ascii="Arial" w:hAnsi="Arial" w:cs="Arial"/>
+          <w:sz w:val="24"/>
+          <w:szCs w:val="24"/>
+        </w:rPr>
+        <w:t>repositori</w:t>
+      </w:r>
+      <w:proofErr w:type="spellEnd"/>
+      <w:r>
+        <w:rPr>
+          <w:rFonts w:ascii="Arial" w:hAnsi="Arial" w:cs="Arial"/>
+          <w:sz w:val="24"/>
+          <w:szCs w:val="24"/>
+        </w:rPr>
+        <w:t xml:space="preserve"> (</w:t>
       </w:r>
       <w:r>
         <w:rPr>
@@ -77,6 +142,188 @@
           <w:szCs w:val="24"/>
         </w:rPr>
       </w:pPr>
+    </w:p>
+    <w:p>
+      <w:pPr>
+        <w:rPr>
+          <w:rFonts w:ascii="Arial" w:hAnsi="Arial" w:cs="Arial"/>
+          <w:b/>
+          <w:bCs/>
+          <w:color w:val="808080" w:themeColor="background1" w:themeShade="80"/>
+          <w:sz w:val="24"/>
+          <w:szCs w:val="24"/>
+        </w:rPr>
+      </w:pPr>
+      <w:proofErr w:type="spellStart"/>
+      <w:r>
+        <w:rPr>
+          <w:rFonts w:ascii="Arial" w:hAnsi="Arial" w:cs="Arial"/>
+          <w:b/>
+          <w:bCs/>
+          <w:color w:val="808080" w:themeColor="background1" w:themeShade="80"/>
+          <w:sz w:val="24"/>
+          <w:szCs w:val="24"/>
+        </w:rPr>
+        <w:t>Pathways</w:t>
+      </w:r>
+      <w:proofErr w:type="spellEnd"/>
+    </w:p>
+    <w:p>
+      <w:pPr>
+        <w:rPr>
+          <w:rFonts w:ascii="Arial" w:hAnsi="Arial" w:cs="Arial"/>
+          <w:color w:val="808080" w:themeColor="background1" w:themeShade="80"/>
+          <w:sz w:val="24"/>
+          <w:szCs w:val="24"/>
+        </w:rPr>
+      </w:pPr>
+      <w:r>
+        <w:rPr>
+          <w:rFonts w:ascii="Arial" w:hAnsi="Arial" w:cs="Arial"/>
+          <w:color w:val="808080" w:themeColor="background1" w:themeShade="80"/>
+          <w:sz w:val="24"/>
+          <w:szCs w:val="24"/>
+        </w:rPr>
+        <w:t>S’ha de dir que la veracitat dels temps entre andanes i sortides és una mica qüestionable. Per exemple, teòricament, tant per anar de l’entrada “</w:t>
+      </w:r>
+      <w:r>
+        <w:rPr>
+          <w:rFonts w:ascii="Arial" w:hAnsi="Arial" w:cs="Arial"/>
+          <w:color w:val="808080" w:themeColor="background1" w:themeShade="80"/>
+          <w:sz w:val="24"/>
+          <w:szCs w:val="24"/>
+        </w:rPr>
+        <w:t>E.43301 - Via Júlia / Joaquim Valls</w:t>
+      </w:r>
+      <w:r>
+        <w:rPr>
+          <w:rFonts w:ascii="Arial" w:hAnsi="Arial" w:cs="Arial"/>
+          <w:color w:val="808080" w:themeColor="background1" w:themeShade="80"/>
+          <w:sz w:val="24"/>
+          <w:szCs w:val="24"/>
+        </w:rPr>
+        <w:t>” a l’andana “</w:t>
+      </w:r>
+      <w:r>
+        <w:rPr>
+          <w:rFonts w:ascii="Arial" w:hAnsi="Arial" w:cs="Arial"/>
+          <w:color w:val="808080" w:themeColor="background1" w:themeShade="80"/>
+          <w:sz w:val="24"/>
+          <w:szCs w:val="24"/>
+        </w:rPr>
+        <w:t>1.433 - Via Júlia</w:t>
+      </w:r>
+      <w:r>
+        <w:rPr>
+          <w:rFonts w:ascii="Arial" w:hAnsi="Arial" w:cs="Arial"/>
+          <w:color w:val="808080" w:themeColor="background1" w:themeShade="80"/>
+          <w:sz w:val="24"/>
+          <w:szCs w:val="24"/>
+        </w:rPr>
+        <w:t>”, tant com per anar de “</w:t>
+      </w:r>
+      <w:r>
+        <w:rPr>
+          <w:rFonts w:ascii="Arial" w:hAnsi="Arial" w:cs="Arial"/>
+          <w:color w:val="808080" w:themeColor="background1" w:themeShade="80"/>
+          <w:sz w:val="24"/>
+          <w:szCs w:val="24"/>
+        </w:rPr>
+        <w:t xml:space="preserve">E.33901 </w:t>
+      </w:r>
+      <w:r>
+        <w:rPr>
+          <w:rFonts w:ascii="Arial" w:hAnsi="Arial" w:cs="Arial"/>
+          <w:color w:val="808080" w:themeColor="background1" w:themeShade="80"/>
+          <w:sz w:val="24"/>
+          <w:szCs w:val="24"/>
+        </w:rPr>
+        <w:t>–</w:t>
+      </w:r>
+      <w:r>
+        <w:rPr>
+          <w:rFonts w:ascii="Arial" w:hAnsi="Arial" w:cs="Arial"/>
+          <w:color w:val="808080" w:themeColor="background1" w:themeShade="80"/>
+          <w:sz w:val="24"/>
+          <w:szCs w:val="24"/>
+        </w:rPr>
+        <w:t xml:space="preserve"> Palamós</w:t>
+      </w:r>
+      <w:r>
+        <w:rPr>
+          <w:rFonts w:ascii="Arial" w:hAnsi="Arial" w:cs="Arial"/>
+          <w:color w:val="808080" w:themeColor="background1" w:themeShade="80"/>
+          <w:sz w:val="24"/>
+          <w:szCs w:val="24"/>
+        </w:rPr>
+        <w:t>” a “</w:t>
+      </w:r>
+      <w:r>
+        <w:rPr>
+          <w:rFonts w:ascii="Arial" w:hAnsi="Arial" w:cs="Arial"/>
+          <w:color w:val="808080" w:themeColor="background1" w:themeShade="80"/>
+          <w:sz w:val="24"/>
+          <w:szCs w:val="24"/>
+        </w:rPr>
+        <w:t>1.339 - Trinitat Nova</w:t>
+      </w:r>
+      <w:r>
+        <w:rPr>
+          <w:rFonts w:ascii="Arial" w:hAnsi="Arial" w:cs="Arial"/>
+          <w:color w:val="808080" w:themeColor="background1" w:themeShade="80"/>
+          <w:sz w:val="24"/>
+          <w:szCs w:val="24"/>
+        </w:rPr>
+        <w:t xml:space="preserve">” es triguen 60s. Però en el primer trajecte hi ha un tram curt d’escales i en el segon n’hi ha tres de llargs. </w:t>
+      </w:r>
+      <w:r>
+        <w:rPr>
+          <w:rFonts w:ascii="Arial" w:hAnsi="Arial" w:cs="Arial"/>
+          <w:color w:val="808080" w:themeColor="background1" w:themeShade="80"/>
+          <w:sz w:val="24"/>
+          <w:szCs w:val="24"/>
+        </w:rPr>
+        <w:sym w:font="Wingdings" w:char="F0DF"/>
+      </w:r>
+      <w:r>
+        <w:rPr>
+          <w:rFonts w:ascii="Arial" w:hAnsi="Arial" w:cs="Arial"/>
+          <w:color w:val="808080" w:themeColor="background1" w:themeShade="80"/>
+          <w:sz w:val="24"/>
+          <w:szCs w:val="24"/>
+        </w:rPr>
+        <w:t xml:space="preserve"> Potser es compten les escales d’abans d’arribar a picar</w:t>
+      </w:r>
+    </w:p>
+    <w:p>
+      <w:pPr>
+        <w:rPr>
+          <w:rFonts w:ascii="Arial" w:hAnsi="Arial" w:cs="Arial"/>
+          <w:sz w:val="24"/>
+          <w:szCs w:val="24"/>
+        </w:rPr>
+      </w:pPr>
+    </w:p>
+    <w:p>
+      <w:pPr>
+        <w:rPr>
+          <w:rFonts w:ascii="Arial" w:hAnsi="Arial" w:cs="Arial"/>
+          <w:b/>
+          <w:bCs/>
+          <w:sz w:val="24"/>
+          <w:szCs w:val="24"/>
+        </w:rPr>
+      </w:pPr>
+      <w:r>
+        <w:rPr>
+          <w:rFonts w:ascii="Arial" w:hAnsi="Arial" w:cs="Arial"/>
+          <w:b/>
+          <w:bCs/>
+          <w:sz w:val="24"/>
+          <w:szCs w:val="24"/>
+        </w:rPr>
+        <w:t>Codis i ordre de parades per línia</w:t>
+      </w:r>
     </w:p>
     <w:p>
       <w:pPr>
@@ -128,6 +375,32 @@
           <w:sz w:val="24"/>
           <w:szCs w:val="24"/>
         </w:rPr>
+        <w:t>Amb la línia 9 i 10 hi ha salts en l’ordre dels identificadors de les parades perquè és un pla que encara està en construcció. És per això que dedueixo que s’han guardat codis específics per les parades que s’inauguraran en els pròxims anys (algunes d’elles entre parades ja existents de la mateixa línia).</w:t>
+      </w:r>
+    </w:p>
+    <w:p>
+      <w:pPr>
+        <w:rPr>
+          <w:rFonts w:ascii="Arial" w:hAnsi="Arial" w:cs="Arial"/>
+          <w:sz w:val="24"/>
+          <w:szCs w:val="24"/>
+        </w:rPr>
+      </w:pPr>
+    </w:p>
+    <w:p>
+      <w:pPr>
+        <w:rPr>
+          <w:rFonts w:ascii="Arial" w:hAnsi="Arial" w:cs="Arial"/>
+          <w:sz w:val="24"/>
+          <w:szCs w:val="24"/>
+        </w:rPr>
+      </w:pPr>
+      <w:r>
+        <w:rPr>
+          <w:rFonts w:ascii="Arial" w:hAnsi="Arial" w:cs="Arial"/>
+          <w:sz w:val="24"/>
+          <w:szCs w:val="24"/>
+        </w:rPr>
         <w:t xml:space="preserve">Cas Liceu explicat a </w:t>
       </w:r>
       <w:r>
@@ -136,7 +409,25 @@
           <w:sz w:val="24"/>
           <w:szCs w:val="24"/>
         </w:rPr>
-        <w:t>.work\05.10.docx</w:t>
+        <w:t>.</w:t>
+      </w:r>
+      <w:proofErr w:type="spellStart"/>
+      <w:r>
+        <w:rPr>
+          <w:rFonts w:ascii="Arial" w:hAnsi="Arial" w:cs="Arial"/>
+          <w:sz w:val="24"/>
+          <w:szCs w:val="24"/>
+        </w:rPr>
+        <w:t>work</w:t>
+      </w:r>
+      <w:proofErr w:type="spellEnd"/>
+      <w:r>
+        <w:rPr>
+          <w:rFonts w:ascii="Arial" w:hAnsi="Arial" w:cs="Arial"/>
+          <w:sz w:val="24"/>
+          <w:szCs w:val="24"/>
+        </w:rPr>
+        <w:t>\05.10.docx</w:t>
       </w:r>
       <w:r>
         <w:rPr>
@@ -234,7 +525,49 @@
         <w:rPr>
           <w:rFonts w:ascii="Arial" w:hAnsi="Arial" w:cs="Arial"/>
         </w:rPr>
-        <w:t>Totes les stop_id de pathways i stop_times estan a stops</w:t>
+        <w:t xml:space="preserve">Totes les </w:t>
+      </w:r>
+      <w:proofErr w:type="spellStart"/>
+      <w:r>
+        <w:rPr>
+          <w:rFonts w:ascii="Arial" w:hAnsi="Arial" w:cs="Arial"/>
+        </w:rPr>
+        <w:t>stop_id</w:t>
+      </w:r>
+      <w:proofErr w:type="spellEnd"/>
+      <w:r>
+        <w:rPr>
+          <w:rFonts w:ascii="Arial" w:hAnsi="Arial" w:cs="Arial"/>
+        </w:rPr>
+        <w:t xml:space="preserve"> de </w:t>
+      </w:r>
+      <w:proofErr w:type="spellStart"/>
+      <w:r>
+        <w:rPr>
+          <w:rFonts w:ascii="Arial" w:hAnsi="Arial" w:cs="Arial"/>
+        </w:rPr>
+        <w:t>pathways</w:t>
+      </w:r>
+      <w:proofErr w:type="spellEnd"/>
+      <w:r>
+        <w:rPr>
+          <w:rFonts w:ascii="Arial" w:hAnsi="Arial" w:cs="Arial"/>
+        </w:rPr>
+        <w:t xml:space="preserve"> i </w:t>
+      </w:r>
+      <w:proofErr w:type="spellStart"/>
+      <w:r>
+        <w:rPr>
+          <w:rFonts w:ascii="Arial" w:hAnsi="Arial" w:cs="Arial"/>
+        </w:rPr>
+        <w:t>stop_times</w:t>
+      </w:r>
+      <w:proofErr w:type="spellEnd"/>
+      <w:r>
+        <w:rPr>
+          <w:rFonts w:ascii="Arial" w:hAnsi="Arial" w:cs="Arial"/>
+        </w:rPr>
+        <w:t xml:space="preserve"> estan a stops</w:t>
       </w:r>
     </w:p>
     <w:p>
@@ -252,8 +585,30 @@
         <w:rPr>
           <w:rFonts w:ascii="Arial" w:hAnsi="Arial" w:cs="Arial"/>
         </w:rPr>
-        <w:t>Tot route_id de trips està a routes</w:t>
-      </w:r>
+        <w:t xml:space="preserve">Tot </w:t>
+      </w:r>
+      <w:proofErr w:type="spellStart"/>
+      <w:r>
+        <w:rPr>
+          <w:rFonts w:ascii="Arial" w:hAnsi="Arial" w:cs="Arial"/>
+        </w:rPr>
+        <w:t>route_id</w:t>
+      </w:r>
+      <w:proofErr w:type="spellEnd"/>
+      <w:r>
+        <w:rPr>
+          <w:rFonts w:ascii="Arial" w:hAnsi="Arial" w:cs="Arial"/>
+        </w:rPr>
+        <w:t xml:space="preserve"> de trips està a </w:t>
+      </w:r>
+      <w:proofErr w:type="spellStart"/>
+      <w:r>
+        <w:rPr>
+          <w:rFonts w:ascii="Arial" w:hAnsi="Arial" w:cs="Arial"/>
+        </w:rPr>
+        <w:t>routes</w:t>
+      </w:r>
+      <w:proofErr w:type="spellEnd"/>
     </w:p>
     <w:p>
       <w:pPr>
@@ -270,7 +625,35 @@
         <w:rPr>
           <w:rFonts w:ascii="Arial" w:hAnsi="Arial" w:cs="Arial"/>
         </w:rPr>
-        <w:t>Tot trip_id de stops_times està a trips</w:t>
+        <w:t xml:space="preserve">Tot </w:t>
+      </w:r>
+      <w:proofErr w:type="spellStart"/>
+      <w:r>
+        <w:rPr>
+          <w:rFonts w:ascii="Arial" w:hAnsi="Arial" w:cs="Arial"/>
+        </w:rPr>
+        <w:t>trip_id</w:t>
+      </w:r>
+      <w:proofErr w:type="spellEnd"/>
+      <w:r>
+        <w:rPr>
+          <w:rFonts w:ascii="Arial" w:hAnsi="Arial" w:cs="Arial"/>
+        </w:rPr>
+        <w:t xml:space="preserve"> de </w:t>
+      </w:r>
+      <w:proofErr w:type="spellStart"/>
+      <w:r>
+        <w:rPr>
+          <w:rFonts w:ascii="Arial" w:hAnsi="Arial" w:cs="Arial"/>
+        </w:rPr>
+        <w:t>stops_times</w:t>
+      </w:r>
+      <w:proofErr w:type="spellEnd"/>
+      <w:r>
+        <w:rPr>
+          <w:rFonts w:ascii="Arial" w:hAnsi="Arial" w:cs="Arial"/>
+        </w:rPr>
+        <w:t xml:space="preserve"> està a trips</w:t>
       </w:r>
     </w:p>
     <w:p>
@@ -288,8 +671,16 @@
         <w:rPr>
           <w:rFonts w:ascii="Arial" w:hAnsi="Arial" w:cs="Arial"/>
         </w:rPr>
-        <w:t>Comprovacions de pathways</w:t>
-      </w:r>
+        <w:t xml:space="preserve">Comprovacions de </w:t>
+      </w:r>
+      <w:proofErr w:type="spellStart"/>
+      <w:r>
+        <w:rPr>
+          <w:rFonts w:ascii="Arial" w:hAnsi="Arial" w:cs="Arial"/>
+        </w:rPr>
+        <w:t>pathways</w:t>
+      </w:r>
+      <w:proofErr w:type="spellEnd"/>
     </w:p>
     <w:p>
       <w:pPr>
@@ -302,12 +693,28 @@
           <w:rFonts w:ascii="Arial" w:hAnsi="Arial" w:cs="Arial"/>
         </w:rPr>
       </w:pPr>
-      <w:r>
-        <w:rPr>
-          <w:rFonts w:ascii="Arial" w:hAnsi="Arial" w:cs="Arial"/>
-        </w:rPr>
-        <w:t>Transfers inclòs a pathways</w:t>
-      </w:r>
+      <w:proofErr w:type="spellStart"/>
+      <w:r>
+        <w:rPr>
+          <w:rFonts w:ascii="Arial" w:hAnsi="Arial" w:cs="Arial"/>
+        </w:rPr>
+        <w:t>Transfers</w:t>
+      </w:r>
+      <w:proofErr w:type="spellEnd"/>
+      <w:r>
+        <w:rPr>
+          <w:rFonts w:ascii="Arial" w:hAnsi="Arial" w:cs="Arial"/>
+        </w:rPr>
+        <w:t xml:space="preserve"> inclòs a </w:t>
+      </w:r>
+      <w:proofErr w:type="spellStart"/>
+      <w:r>
+        <w:rPr>
+          <w:rFonts w:ascii="Arial" w:hAnsi="Arial" w:cs="Arial"/>
+        </w:rPr>
+        <w:t>pathways</w:t>
+      </w:r>
+      <w:proofErr w:type="spellEnd"/>
       <w:r>
         <w:rPr>
           <w:rFonts w:ascii="Arial" w:hAnsi="Arial" w:cs="Arial"/>
@@ -330,7 +737,21 @@
         <w:rPr>
           <w:rFonts w:ascii="Arial" w:hAnsi="Arial" w:cs="Arial"/>
         </w:rPr>
-        <w:t>A pathways existeixen sempre les combinacions dels dos sentits</w:t>
+        <w:t xml:space="preserve">A </w:t>
+      </w:r>
+      <w:proofErr w:type="spellStart"/>
+      <w:r>
+        <w:rPr>
+          <w:rFonts w:ascii="Arial" w:hAnsi="Arial" w:cs="Arial"/>
+        </w:rPr>
+        <w:t>pathways</w:t>
+      </w:r>
+      <w:proofErr w:type="spellEnd"/>
+      <w:r>
+        <w:rPr>
+          <w:rFonts w:ascii="Arial" w:hAnsi="Arial" w:cs="Arial"/>
+        </w:rPr>
+        <w:t xml:space="preserve"> existeixen sempre les combinacions dels dos sentits</w:t>
       </w:r>
       <w:r>
         <w:rPr>
@@ -362,11 +783,20 @@
           <w:rFonts w:ascii="Arial" w:hAnsi="Arial" w:cs="Arial"/>
         </w:rPr>
       </w:pPr>
-      <w:r>
-        <w:rPr>
-          <w:rFonts w:ascii="Arial" w:hAnsi="Arial" w:cs="Arial"/>
-        </w:rPr>
-        <w:t xml:space="preserve">Traversal_time igual pels dos sentits (excepte quan no hi ha un sentit </w:t>
+      <w:proofErr w:type="spellStart"/>
+      <w:r>
+        <w:rPr>
+          <w:rFonts w:ascii="Arial" w:hAnsi="Arial" w:cs="Arial"/>
+        </w:rPr>
+        <w:lastRenderedPageBreak/>
+        <w:t>Traversal_time</w:t>
+      </w:r>
+      <w:proofErr w:type="spellEnd"/>
+      <w:r>
+        <w:rPr>
+          <w:rFonts w:ascii="Arial" w:hAnsi="Arial" w:cs="Arial"/>
+        </w:rPr>
+        <w:t xml:space="preserve"> igual pels dos sentits (excepte quan no hi ha un sentit </w:t>
       </w:r>
       <w:r>
         <w:rPr>
@@ -392,11 +822,19 @@
           <w:rFonts w:ascii="Arial" w:hAnsi="Arial" w:cs="Arial"/>
         </w:rPr>
       </w:pPr>
-      <w:r>
-        <w:rPr>
-          <w:rFonts w:ascii="Arial" w:hAnsi="Arial" w:cs="Arial"/>
-        </w:rPr>
-        <w:t xml:space="preserve">Traversal_time múltiple de 15 (només curiositat) </w:t>
+      <w:proofErr w:type="spellStart"/>
+      <w:r>
+        <w:rPr>
+          <w:rFonts w:ascii="Arial" w:hAnsi="Arial" w:cs="Arial"/>
+        </w:rPr>
+        <w:t>Traversal_time</w:t>
+      </w:r>
+      <w:proofErr w:type="spellEnd"/>
+      <w:r>
+        <w:rPr>
+          <w:rFonts w:ascii="Arial" w:hAnsi="Arial" w:cs="Arial"/>
+        </w:rPr>
+        <w:t xml:space="preserve"> múltiple de 15 (només curiositat) </w:t>
       </w:r>
     </w:p>
     <w:p>
@@ -480,8 +918,16 @@
         <w:rPr>
           <w:rFonts w:ascii="Arial" w:hAnsi="Arial" w:cs="Arial"/>
         </w:rPr>
-        <w:t>Comprovacions de stop_times</w:t>
-      </w:r>
+        <w:t xml:space="preserve">Comprovacions de </w:t>
+      </w:r>
+      <w:proofErr w:type="spellStart"/>
+      <w:r>
+        <w:rPr>
+          <w:rFonts w:ascii="Arial" w:hAnsi="Arial" w:cs="Arial"/>
+        </w:rPr>
+        <w:t>stop_times</w:t>
+      </w:r>
+      <w:proofErr w:type="spellEnd"/>
     </w:p>
     <w:p>
       <w:pPr>
@@ -498,7 +944,35 @@
         <w:rPr>
           <w:rFonts w:ascii="Arial" w:hAnsi="Arial" w:cs="Arial"/>
         </w:rPr>
-        <w:t xml:space="preserve">Repeticions de blocs de trip_id sencers a stop_times </w:t>
+        <w:t xml:space="preserve">Repeticions de blocs de </w:t>
+      </w:r>
+      <w:proofErr w:type="spellStart"/>
+      <w:r>
+        <w:rPr>
+          <w:rFonts w:ascii="Arial" w:hAnsi="Arial" w:cs="Arial"/>
+        </w:rPr>
+        <w:t>trip_id</w:t>
+      </w:r>
+      <w:proofErr w:type="spellEnd"/>
+      <w:r>
+        <w:rPr>
+          <w:rFonts w:ascii="Arial" w:hAnsi="Arial" w:cs="Arial"/>
+        </w:rPr>
+        <w:t xml:space="preserve"> sencers a </w:t>
+      </w:r>
+      <w:proofErr w:type="spellStart"/>
+      <w:r>
+        <w:rPr>
+          <w:rFonts w:ascii="Arial" w:hAnsi="Arial" w:cs="Arial"/>
+        </w:rPr>
+        <w:t>stop_times</w:t>
+      </w:r>
+      <w:proofErr w:type="spellEnd"/>
+      <w:r>
+        <w:rPr>
+          <w:rFonts w:ascii="Arial" w:hAnsi="Arial" w:cs="Arial"/>
+        </w:rPr>
+        <w:t xml:space="preserve"> </w:t>
       </w:r>
       <w:r>
         <w:rPr>
@@ -510,8 +984,30 @@
         <w:rPr>
           <w:rFonts w:ascii="Arial" w:hAnsi="Arial" w:cs="Arial"/>
         </w:rPr>
-        <w:t xml:space="preserve"> creació de stop_times_cleaned i trips_cleaned</w:t>
-      </w:r>
+        <w:t xml:space="preserve"> creació de </w:t>
+      </w:r>
+      <w:proofErr w:type="spellStart"/>
+      <w:r>
+        <w:rPr>
+          <w:rFonts w:ascii="Arial" w:hAnsi="Arial" w:cs="Arial"/>
+        </w:rPr>
+        <w:t>stop_times_cleaned</w:t>
+      </w:r>
+      <w:proofErr w:type="spellEnd"/>
+      <w:r>
+        <w:rPr>
+          <w:rFonts w:ascii="Arial" w:hAnsi="Arial" w:cs="Arial"/>
+        </w:rPr>
+        <w:t xml:space="preserve"> i </w:t>
+      </w:r>
+      <w:proofErr w:type="spellStart"/>
+      <w:r>
+        <w:rPr>
+          <w:rFonts w:ascii="Arial" w:hAnsi="Arial" w:cs="Arial"/>
+        </w:rPr>
+        <w:t>trips_cleaned</w:t>
+      </w:r>
+      <w:proofErr w:type="spellEnd"/>
     </w:p>
     <w:p>
       <w:pPr>
@@ -524,11 +1020,19 @@
           <w:rFonts w:ascii="Arial" w:hAnsi="Arial" w:cs="Arial"/>
         </w:rPr>
       </w:pPr>
-      <w:r>
-        <w:rPr>
-          <w:rFonts w:ascii="Arial" w:hAnsi="Arial" w:cs="Arial"/>
-        </w:rPr>
-        <w:t>Stop_sequence sempre s’incrementa d’un en un</w:t>
+      <w:proofErr w:type="spellStart"/>
+      <w:r>
+        <w:rPr>
+          <w:rFonts w:ascii="Arial" w:hAnsi="Arial" w:cs="Arial"/>
+        </w:rPr>
+        <w:t>Stop_sequence</w:t>
+      </w:r>
+      <w:proofErr w:type="spellEnd"/>
+      <w:r>
+        <w:rPr>
+          <w:rFonts w:ascii="Arial" w:hAnsi="Arial" w:cs="Arial"/>
+        </w:rPr>
+        <w:t xml:space="preserve"> sempre s’incrementa d’un en un</w:t>
       </w:r>
     </w:p>
     <w:p>
@@ -546,7 +1050,6 @@
         <w:rPr>
           <w:rFonts w:ascii="Arial" w:hAnsi="Arial" w:cs="Arial"/>
         </w:rPr>
-        <w:lastRenderedPageBreak/>
         <w:t>Comprovacions de trips</w:t>
       </w:r>
     </w:p>
@@ -565,7 +1068,49 @@
         <w:rPr>
           <w:rFonts w:ascii="Arial" w:hAnsi="Arial" w:cs="Arial"/>
         </w:rPr>
-        <w:t>Per cada “route_id” tenim dues parelles disjuntes de (“trip_headsign”, “direction_id”). És a dir, per identificar la direcció dels viatges podem utilitzar ambdues</w:t>
+        <w:t>Per cada “</w:t>
+      </w:r>
+      <w:proofErr w:type="spellStart"/>
+      <w:r>
+        <w:rPr>
+          <w:rFonts w:ascii="Arial" w:hAnsi="Arial" w:cs="Arial"/>
+        </w:rPr>
+        <w:t>route_id</w:t>
+      </w:r>
+      <w:proofErr w:type="spellEnd"/>
+      <w:r>
+        <w:rPr>
+          <w:rFonts w:ascii="Arial" w:hAnsi="Arial" w:cs="Arial"/>
+        </w:rPr>
+        <w:t>” tenim dues parelles disjuntes de (“</w:t>
+      </w:r>
+      <w:proofErr w:type="spellStart"/>
+      <w:r>
+        <w:rPr>
+          <w:rFonts w:ascii="Arial" w:hAnsi="Arial" w:cs="Arial"/>
+        </w:rPr>
+        <w:t>trip_headsign</w:t>
+      </w:r>
+      <w:proofErr w:type="spellEnd"/>
+      <w:r>
+        <w:rPr>
+          <w:rFonts w:ascii="Arial" w:hAnsi="Arial" w:cs="Arial"/>
+        </w:rPr>
+        <w:t>”, “</w:t>
+      </w:r>
+      <w:proofErr w:type="spellStart"/>
+      <w:r>
+        <w:rPr>
+          <w:rFonts w:ascii="Arial" w:hAnsi="Arial" w:cs="Arial"/>
+        </w:rPr>
+        <w:t>direction_id</w:t>
+      </w:r>
+      <w:proofErr w:type="spellEnd"/>
+      <w:r>
+        <w:rPr>
+          <w:rFonts w:ascii="Arial" w:hAnsi="Arial" w:cs="Arial"/>
+        </w:rPr>
+        <w:t>”). És a dir, per identificar la direcció dels viatges podem utilitzar ambdues</w:t>
       </w:r>
     </w:p>
     <w:sectPr>

</xml_diff>